<commit_message>
docs(marking guide): update F122A13 template and parsing
- content_generator: refine marking guide generation and assessment tool hooks
- utils/markdownit: fix Markdown rendering quirks for lists/inline code
- gptgen/content_generator, main: integrate improved workflows and flags
- init/assessment_tools: small fixes and stability improvements
- uoc_api: update endpoints/handling for UoC lookup
- pyproject/uv.lock: update deps; sync lockfile

Note: excludes log files from commit.
</commit_message>
<xml_diff>
--- a/templates/Instructions to Assessors and Marking Guide (F122A13).docx
+++ b/templates/Instructions to Assessors and Marking Guide (F122A13).docx
@@ -79,7 +79,6 @@
               <w:bottom w:val="single" w:sz="4" w:space="0" w:color="000000"/>
               <w:right w:val="single" w:sz="4" w:space="0" w:color="000000"/>
             </w:tcBorders>
-            <w:shd w:val="clear" w:color="auto" w:fill="auto"/>
             <w:vAlign w:val="center"/>
           </w:tcPr>
           <w:p>
@@ -145,7 +144,6 @@
               <w:bottom w:val="single" w:sz="4" w:space="0" w:color="000000"/>
               <w:right w:val="single" w:sz="4" w:space="0" w:color="000000"/>
             </w:tcBorders>
-            <w:shd w:val="clear" w:color="auto" w:fill="auto"/>
             <w:vAlign w:val="center"/>
           </w:tcPr>
           <w:p>
@@ -247,7 +245,6 @@
               <w:bottom w:val="single" w:sz="4" w:space="0" w:color="000000"/>
               <w:right w:val="single" w:sz="4" w:space="0" w:color="000000"/>
             </w:tcBorders>
-            <w:shd w:val="clear" w:color="auto" w:fill="auto"/>
             <w:vAlign w:val="center"/>
           </w:tcPr>
           <w:p>
@@ -417,7 +414,6 @@
         <w:tc>
           <w:tcPr>
             <w:tcW w:w="3940" w:type="dxa"/>
-            <w:shd w:val="clear" w:color="auto" w:fill="auto"/>
           </w:tcPr>
           <w:p>
             <w:pPr>
@@ -437,7 +433,6 @@
         <w:tc>
           <w:tcPr>
             <w:tcW w:w="5699" w:type="dxa"/>
-            <w:shd w:val="clear" w:color="auto" w:fill="auto"/>
             <w:vAlign w:val="center"/>
           </w:tcPr>
           <w:p>
@@ -463,7 +458,6 @@
         <w:tc>
           <w:tcPr>
             <w:tcW w:w="3940" w:type="dxa"/>
-            <w:shd w:val="clear" w:color="auto" w:fill="auto"/>
           </w:tcPr>
           <w:p>
             <w:pPr>
@@ -483,7 +477,6 @@
         <w:tc>
           <w:tcPr>
             <w:tcW w:w="5699" w:type="dxa"/>
-            <w:shd w:val="clear" w:color="auto" w:fill="auto"/>
             <w:vAlign w:val="center"/>
           </w:tcPr>
           <w:p>
@@ -675,86 +668,32 @@
             </w:r>
           </w:p>
         </w:tc>
-        <w:sdt>
-          <w:sdtPr>
-            <w:rPr>
-              <w:rFonts w:ascii="Arial" w:eastAsia="SimSun" w:hAnsi="Arial" w:cs="Arial"/>
-              <w:bCs/>
-              <w:i/>
-              <w:color w:val="0000FF"/>
-              <w:sz w:val="20"/>
-              <w:szCs w:val="18"/>
-            </w:rPr>
-            <w:id w:val="-1735379666"/>
-            <w:placeholder>
-              <w:docPart w:val="FE28F2B68AF940FDA5525A33A493E34F"/>
-            </w:placeholder>
-            <w:showingPlcHdr/>
-            <w:text/>
-          </w:sdtPr>
-          <w:sdtContent>
-            <w:tc>
-              <w:tcPr>
-                <w:tcW w:w="5403" w:type="dxa"/>
-                <w:tcBorders>
-                  <w:top w:val="single" w:sz="4" w:space="0" w:color="000000"/>
-                  <w:left w:val="single" w:sz="4" w:space="0" w:color="000000"/>
-                  <w:bottom w:val="single" w:sz="4" w:space="0" w:color="000000"/>
-                  <w:right w:val="single" w:sz="4" w:space="0" w:color="000000"/>
-                </w:tcBorders>
-                <w:shd w:val="clear" w:color="auto" w:fill="auto"/>
-                <w:vAlign w:val="center"/>
-              </w:tcPr>
-              <w:p>
-                <w:pPr>
-                  <w:pStyle w:val="NoSpacing"/>
-                  <w:spacing w:beforeLines="60" w:before="144" w:afterLines="60" w:after="144"/>
-                  <w:rPr>
-                    <w:rFonts w:ascii="Arial" w:eastAsia="SimSun" w:hAnsi="Arial" w:cs="Arial"/>
-                    <w:bCs/>
-                    <w:i/>
-                    <w:color w:val="0000FF"/>
-                    <w:sz w:val="20"/>
-                    <w:szCs w:val="18"/>
-                  </w:rPr>
-                </w:pPr>
-                <w:r>
-                  <w:rPr>
-                    <w:rFonts w:ascii="Arial" w:eastAsia="SimSun" w:hAnsi="Arial" w:cs="Arial"/>
-                    <w:bCs/>
-                    <w:i/>
-                    <w:color w:val="0000FF"/>
-                    <w:sz w:val="20"/>
-                    <w:szCs w:val="18"/>
-                  </w:rPr>
-                  <w:t>List here</w:t>
-                </w:r>
-                <w:r>
-                  <w:rPr>
-                    <w:rFonts w:ascii="Arial" w:eastAsia="SimSun" w:hAnsi="Arial" w:cs="Arial"/>
-                    <w:bCs/>
-                    <w:i/>
-                    <w:color w:val="0000FF"/>
-                    <w:sz w:val="20"/>
-                    <w:szCs w:val="18"/>
-                  </w:rPr>
-                  <w:t>:</w:t>
-                </w:r>
-                <w:r>
-                  <w:rPr>
-                    <w:rFonts w:ascii="Arial" w:eastAsia="SimSun" w:hAnsi="Arial" w:cs="Arial"/>
-                    <w:bCs/>
-                    <w:i/>
-                    <w:color w:val="0000FF"/>
-                    <w:sz w:val="20"/>
-                    <w:szCs w:val="18"/>
-                  </w:rPr>
-                  <w:t xml:space="preserve"> campus, classroom, workshop, workplace, simulated work environment</w:t>
-                </w:r>
-              </w:p>
-            </w:tc>
-          </w:sdtContent>
-        </w:sdt>
+        <w:tc>
+          <w:tcPr>
+            <w:tcW w:w="5403" w:type="dxa"/>
+            <w:tcBorders>
+              <w:top w:val="single" w:sz="4" w:space="0" w:color="000000"/>
+              <w:left w:val="single" w:sz="4" w:space="0" w:color="000000"/>
+              <w:bottom w:val="single" w:sz="4" w:space="0" w:color="000000"/>
+              <w:right w:val="single" w:sz="4" w:space="0" w:color="000000"/>
+            </w:tcBorders>
+            <w:vAlign w:val="center"/>
+          </w:tcPr>
+          <w:p>
+            <w:pPr>
+              <w:pStyle w:val="NoSpacing"/>
+              <w:spacing w:beforeLines="60" w:before="144" w:afterLines="60" w:after="144"/>
+              <w:rPr>
+                <w:rFonts w:ascii="Arial" w:eastAsia="SimSun" w:hAnsi="Arial" w:cs="Arial"/>
+                <w:bCs/>
+                <w:i/>
+                <w:color w:val="0000FF"/>
+                <w:sz w:val="20"/>
+                <w:szCs w:val="18"/>
+              </w:rPr>
+            </w:pPr>
+          </w:p>
+        </w:tc>
       </w:tr>
       <w:tr>
         <w:trPr>
@@ -792,64 +731,32 @@
             </w:r>
           </w:p>
         </w:tc>
-        <w:sdt>
-          <w:sdtPr>
-            <w:rPr>
-              <w:rFonts w:ascii="Arial" w:eastAsia="SimSun" w:hAnsi="Arial" w:cs="Arial"/>
-              <w:bCs/>
-              <w:i/>
-              <w:color w:val="0000FF"/>
-              <w:sz w:val="20"/>
-              <w:szCs w:val="18"/>
-            </w:rPr>
-            <w:id w:val="-934592429"/>
-            <w:placeholder>
-              <w:docPart w:val="4D34EA57128A4DB488F9A0E12FABC56E"/>
-            </w:placeholder>
-            <w:showingPlcHdr/>
-            <w:text/>
-          </w:sdtPr>
-          <w:sdtContent>
-            <w:tc>
-              <w:tcPr>
-                <w:tcW w:w="5403" w:type="dxa"/>
-                <w:tcBorders>
-                  <w:top w:val="single" w:sz="4" w:space="0" w:color="000000"/>
-                  <w:left w:val="single" w:sz="4" w:space="0" w:color="000000"/>
-                  <w:bottom w:val="single" w:sz="4" w:space="0" w:color="000000"/>
-                  <w:right w:val="single" w:sz="4" w:space="0" w:color="000000"/>
-                </w:tcBorders>
-                <w:shd w:val="clear" w:color="auto" w:fill="auto"/>
-                <w:vAlign w:val="center"/>
-              </w:tcPr>
-              <w:p>
-                <w:pPr>
-                  <w:pStyle w:val="NoSpacing"/>
-                  <w:spacing w:beforeLines="60" w:before="144" w:afterLines="60" w:after="144"/>
-                  <w:rPr>
-                    <w:rFonts w:ascii="Arial" w:eastAsia="SimSun" w:hAnsi="Arial" w:cs="Arial"/>
-                    <w:bCs/>
-                    <w:i/>
-                    <w:color w:val="0000FF"/>
-                    <w:sz w:val="20"/>
-                    <w:szCs w:val="18"/>
-                  </w:rPr>
-                </w:pPr>
-                <w:r>
-                  <w:rPr>
-                    <w:rFonts w:ascii="Arial" w:eastAsia="SimSun" w:hAnsi="Arial" w:cs="Arial"/>
-                    <w:bCs/>
-                    <w:i/>
-                    <w:color w:val="0000FF"/>
-                    <w:sz w:val="20"/>
-                    <w:szCs w:val="18"/>
-                  </w:rPr>
-                  <w:t>Date of assessment</w:t>
-                </w:r>
-              </w:p>
-            </w:tc>
-          </w:sdtContent>
-        </w:sdt>
+        <w:tc>
+          <w:tcPr>
+            <w:tcW w:w="5403" w:type="dxa"/>
+            <w:tcBorders>
+              <w:top w:val="single" w:sz="4" w:space="0" w:color="000000"/>
+              <w:left w:val="single" w:sz="4" w:space="0" w:color="000000"/>
+              <w:bottom w:val="single" w:sz="4" w:space="0" w:color="000000"/>
+              <w:right w:val="single" w:sz="4" w:space="0" w:color="000000"/>
+            </w:tcBorders>
+            <w:vAlign w:val="center"/>
+          </w:tcPr>
+          <w:p>
+            <w:pPr>
+              <w:pStyle w:val="NoSpacing"/>
+              <w:spacing w:beforeLines="60" w:before="144" w:afterLines="60" w:after="144"/>
+              <w:rPr>
+                <w:rFonts w:ascii="Arial" w:eastAsia="SimSun" w:hAnsi="Arial" w:cs="Arial"/>
+                <w:bCs/>
+                <w:i/>
+                <w:color w:val="0000FF"/>
+                <w:sz w:val="20"/>
+                <w:szCs w:val="18"/>
+              </w:rPr>
+            </w:pPr>
+          </w:p>
+        </w:tc>
       </w:tr>
       <w:tr>
         <w:trPr>
@@ -894,64 +801,32 @@
             </w:r>
           </w:p>
         </w:tc>
-        <w:sdt>
-          <w:sdtPr>
-            <w:rPr>
-              <w:rFonts w:ascii="Arial" w:eastAsia="SimSun" w:hAnsi="Arial" w:cs="Arial"/>
-              <w:bCs/>
-              <w:i/>
-              <w:color w:val="0000FF"/>
-              <w:sz w:val="20"/>
-              <w:szCs w:val="18"/>
-            </w:rPr>
-            <w:id w:val="1308899065"/>
-            <w:placeholder>
-              <w:docPart w:val="C4E36727C7B44844ABB3129335FBED3C"/>
-            </w:placeholder>
-            <w:showingPlcHdr/>
-            <w:text/>
-          </w:sdtPr>
-          <w:sdtContent>
-            <w:tc>
-              <w:tcPr>
-                <w:tcW w:w="5403" w:type="dxa"/>
-                <w:tcBorders>
-                  <w:top w:val="single" w:sz="4" w:space="0" w:color="000000"/>
-                  <w:left w:val="single" w:sz="4" w:space="0" w:color="000000"/>
-                  <w:bottom w:val="single" w:sz="4" w:space="0" w:color="000000"/>
-                  <w:right w:val="single" w:sz="4" w:space="0" w:color="000000"/>
-                </w:tcBorders>
-                <w:shd w:val="clear" w:color="auto" w:fill="auto"/>
-                <w:vAlign w:val="center"/>
-              </w:tcPr>
-              <w:p>
-                <w:pPr>
-                  <w:pStyle w:val="NoSpacing"/>
-                  <w:spacing w:beforeLines="60" w:before="144" w:afterLines="60" w:after="144"/>
-                  <w:rPr>
-                    <w:rFonts w:ascii="Arial" w:eastAsia="SimSun" w:hAnsi="Arial" w:cs="Arial"/>
-                    <w:bCs/>
-                    <w:i/>
-                    <w:color w:val="0000FF"/>
-                    <w:sz w:val="20"/>
-                    <w:szCs w:val="18"/>
-                  </w:rPr>
-                </w:pPr>
-                <w:r>
-                  <w:rPr>
-                    <w:rFonts w:ascii="Arial" w:eastAsia="SimSun" w:hAnsi="Arial" w:cs="Arial"/>
-                    <w:bCs/>
-                    <w:i/>
-                    <w:color w:val="0000FF"/>
-                    <w:sz w:val="20"/>
-                    <w:szCs w:val="18"/>
-                  </w:rPr>
-                  <w:t>Time allocated for assessment</w:t>
-                </w:r>
-              </w:p>
-            </w:tc>
-          </w:sdtContent>
-        </w:sdt>
+        <w:tc>
+          <w:tcPr>
+            <w:tcW w:w="5403" w:type="dxa"/>
+            <w:tcBorders>
+              <w:top w:val="single" w:sz="4" w:space="0" w:color="000000"/>
+              <w:left w:val="single" w:sz="4" w:space="0" w:color="000000"/>
+              <w:bottom w:val="single" w:sz="4" w:space="0" w:color="000000"/>
+              <w:right w:val="single" w:sz="4" w:space="0" w:color="000000"/>
+            </w:tcBorders>
+            <w:vAlign w:val="center"/>
+          </w:tcPr>
+          <w:p>
+            <w:pPr>
+              <w:pStyle w:val="NoSpacing"/>
+              <w:spacing w:beforeLines="60" w:before="144" w:afterLines="60" w:after="144"/>
+              <w:rPr>
+                <w:rFonts w:ascii="Arial" w:eastAsia="SimSun" w:hAnsi="Arial" w:cs="Arial"/>
+                <w:bCs/>
+                <w:i/>
+                <w:color w:val="0000FF"/>
+                <w:sz w:val="20"/>
+                <w:szCs w:val="18"/>
+              </w:rPr>
+            </w:pPr>
+          </w:p>
+        </w:tc>
       </w:tr>
       <w:tr>
         <w:trPr>
@@ -996,97 +871,32 @@
             </w:r>
           </w:p>
         </w:tc>
-        <w:sdt>
-          <w:sdtPr>
-            <w:rPr>
-              <w:rFonts w:ascii="Arial" w:eastAsia="SimSun" w:hAnsi="Arial" w:cs="Arial"/>
-              <w:bCs/>
-              <w:i/>
-              <w:color w:val="0000FF"/>
-              <w:sz w:val="20"/>
-              <w:szCs w:val="18"/>
-            </w:rPr>
-            <w:id w:val="1482435332"/>
-            <w:placeholder>
-              <w:docPart w:val="A7722ECEAAD64248A7C6FFC9ABF76B13"/>
-            </w:placeholder>
-            <w:showingPlcHdr/>
-            <w:text/>
-          </w:sdtPr>
-          <w:sdtContent>
-            <w:tc>
-              <w:tcPr>
-                <w:tcW w:w="5403" w:type="dxa"/>
-                <w:tcBorders>
-                  <w:top w:val="single" w:sz="4" w:space="0" w:color="000000"/>
-                  <w:left w:val="single" w:sz="4" w:space="0" w:color="000000"/>
-                  <w:bottom w:val="single" w:sz="4" w:space="0" w:color="000000"/>
-                  <w:right w:val="single" w:sz="4" w:space="0" w:color="000000"/>
-                </w:tcBorders>
-                <w:shd w:val="clear" w:color="auto" w:fill="auto"/>
-                <w:vAlign w:val="center"/>
-              </w:tcPr>
-              <w:p>
-                <w:pPr>
-                  <w:pStyle w:val="NoSpacing"/>
-                  <w:spacing w:beforeLines="60" w:before="144" w:afterLines="60" w:after="144"/>
-                  <w:rPr>
-                    <w:rFonts w:ascii="Arial" w:eastAsia="SimSun" w:hAnsi="Arial" w:cs="Arial"/>
-                    <w:bCs/>
-                    <w:i/>
-                    <w:color w:val="0000FF"/>
-                    <w:sz w:val="20"/>
-                    <w:szCs w:val="18"/>
-                  </w:rPr>
-                </w:pPr>
-                <w:r>
-                  <w:rPr>
-                    <w:rFonts w:ascii="Arial" w:eastAsia="SimSun" w:hAnsi="Arial" w:cs="Arial"/>
-                    <w:bCs/>
-                    <w:i/>
-                    <w:color w:val="0000FF"/>
-                    <w:sz w:val="20"/>
-                    <w:szCs w:val="18"/>
-                  </w:rPr>
-                  <w:t xml:space="preserve">List here all the resources required </w:t>
-                </w:r>
-                <w:r>
-                  <w:rPr>
-                    <w:rFonts w:ascii="Arial" w:eastAsia="SimSun" w:hAnsi="Arial" w:cs="Arial"/>
-                    <w:bCs/>
-                    <w:i/>
-                    <w:color w:val="0000FF"/>
-                    <w:sz w:val="20"/>
-                    <w:szCs w:val="18"/>
-                  </w:rPr>
-                  <w:t xml:space="preserve">to conduct assessment task </w:t>
-                </w:r>
-                <w:r>
-                  <w:rPr>
-                    <w:rFonts w:ascii="Arial" w:eastAsia="SimSun" w:hAnsi="Arial" w:cs="Arial"/>
-                    <w:bCs/>
-                    <w:i/>
-                    <w:color w:val="0000FF"/>
-                    <w:sz w:val="20"/>
-                    <w:szCs w:val="18"/>
-                  </w:rPr>
-                  <w:t xml:space="preserve">eg tools, materials, documentation, JSAs, PPE, </w:t>
-                </w:r>
-                <w:r>
-                  <w:rPr>
-                    <w:rFonts w:ascii="Arial" w:eastAsia="SimSun" w:hAnsi="Arial" w:cs="Arial"/>
-                    <w:bCs/>
-                    <w:i/>
-                    <w:color w:val="0000FF"/>
-                    <w:sz w:val="20"/>
-                    <w:szCs w:val="18"/>
-                  </w:rPr>
-                  <w:t>mannequins, student instruction guides, workplace simulation equipment</w:t>
-                </w:r>
-              </w:p>
-            </w:tc>
-          </w:sdtContent>
-        </w:sdt>
+        <w:tc>
+          <w:tcPr>
+            <w:tcW w:w="5403" w:type="dxa"/>
+            <w:tcBorders>
+              <w:top w:val="single" w:sz="4" w:space="0" w:color="000000"/>
+              <w:left w:val="single" w:sz="4" w:space="0" w:color="000000"/>
+              <w:bottom w:val="single" w:sz="4" w:space="0" w:color="000000"/>
+              <w:right w:val="single" w:sz="4" w:space="0" w:color="000000"/>
+            </w:tcBorders>
+            <w:vAlign w:val="center"/>
+          </w:tcPr>
+          <w:p>
+            <w:pPr>
+              <w:pStyle w:val="NoSpacing"/>
+              <w:spacing w:beforeLines="60" w:before="144" w:afterLines="60" w:after="144"/>
+              <w:rPr>
+                <w:rFonts w:ascii="Arial" w:eastAsia="SimSun" w:hAnsi="Arial" w:cs="Arial"/>
+                <w:bCs/>
+                <w:i/>
+                <w:color w:val="0000FF"/>
+                <w:sz w:val="20"/>
+                <w:szCs w:val="18"/>
+              </w:rPr>
+            </w:pPr>
+          </w:p>
+        </w:tc>
       </w:tr>
       <w:tr>
         <w:trPr>
@@ -1120,86 +930,32 @@
             </w:r>
           </w:p>
         </w:tc>
-        <w:sdt>
-          <w:sdtPr>
-            <w:rPr>
-              <w:rFonts w:ascii="Arial" w:eastAsia="SimSun" w:hAnsi="Arial" w:cs="Arial"/>
-              <w:bCs/>
-              <w:i/>
-              <w:color w:val="0000FF"/>
-              <w:sz w:val="20"/>
-              <w:szCs w:val="18"/>
-            </w:rPr>
-            <w:id w:val="1510492968"/>
-            <w:placeholder>
-              <w:docPart w:val="3114E56CADCB49AA8E09B8ADBDB1DE15"/>
-            </w:placeholder>
-            <w:showingPlcHdr/>
-            <w:text/>
-          </w:sdtPr>
-          <w:sdtContent>
-            <w:tc>
-              <w:tcPr>
-                <w:tcW w:w="5403" w:type="dxa"/>
-                <w:tcBorders>
-                  <w:top w:val="single" w:sz="4" w:space="0" w:color="000000"/>
-                  <w:left w:val="single" w:sz="4" w:space="0" w:color="000000"/>
-                  <w:bottom w:val="single" w:sz="4" w:space="0" w:color="000000"/>
-                  <w:right w:val="single" w:sz="4" w:space="0" w:color="000000"/>
-                </w:tcBorders>
-                <w:shd w:val="clear" w:color="auto" w:fill="auto"/>
-                <w:vAlign w:val="center"/>
-              </w:tcPr>
-              <w:p>
-                <w:pPr>
-                  <w:pStyle w:val="NoSpacing"/>
-                  <w:spacing w:beforeLines="60" w:before="144" w:afterLines="60" w:after="144"/>
-                  <w:rPr>
-                    <w:rFonts w:ascii="Arial" w:eastAsia="SimSun" w:hAnsi="Arial" w:cs="Arial"/>
-                    <w:bCs/>
-                    <w:i/>
-                    <w:color w:val="0000FF"/>
-                    <w:sz w:val="20"/>
-                    <w:szCs w:val="18"/>
-                  </w:rPr>
-                </w:pPr>
-                <w:r>
-                  <w:rPr>
-                    <w:rFonts w:ascii="Arial" w:eastAsia="SimSun" w:hAnsi="Arial" w:cs="Arial"/>
-                    <w:bCs/>
-                    <w:i/>
-                    <w:color w:val="0000FF"/>
-                    <w:sz w:val="20"/>
-                    <w:szCs w:val="18"/>
-                  </w:rPr>
-                  <w:t xml:space="preserve">Include: </w:t>
-                </w:r>
-                <w:r>
-                  <w:rPr>
-                    <w:rFonts w:ascii="Arial" w:eastAsia="SimSun" w:hAnsi="Arial" w:cs="Arial"/>
-                    <w:bCs/>
-                    <w:i/>
-                    <w:color w:val="0000FF"/>
-                    <w:sz w:val="20"/>
-                    <w:szCs w:val="18"/>
-                  </w:rPr>
-                  <w:t xml:space="preserve">workshop safety briefs, </w:t>
-                </w:r>
-                <w:r>
-                  <w:rPr>
-                    <w:rFonts w:ascii="Arial" w:eastAsia="SimSun" w:hAnsi="Arial" w:cs="Arial"/>
-                    <w:bCs/>
-                    <w:i/>
-                    <w:color w:val="0000FF"/>
-                    <w:sz w:val="20"/>
-                    <w:szCs w:val="18"/>
-                  </w:rPr>
-                  <w:t>material or tool safety guides and requirements, evacuation plans, manual handling instructions, MSDS, PPE instructions</w:t>
-                </w:r>
-              </w:p>
-            </w:tc>
-          </w:sdtContent>
-        </w:sdt>
+        <w:tc>
+          <w:tcPr>
+            <w:tcW w:w="5403" w:type="dxa"/>
+            <w:tcBorders>
+              <w:top w:val="single" w:sz="4" w:space="0" w:color="000000"/>
+              <w:left w:val="single" w:sz="4" w:space="0" w:color="000000"/>
+              <w:bottom w:val="single" w:sz="4" w:space="0" w:color="000000"/>
+              <w:right w:val="single" w:sz="4" w:space="0" w:color="000000"/>
+            </w:tcBorders>
+            <w:vAlign w:val="center"/>
+          </w:tcPr>
+          <w:p>
+            <w:pPr>
+              <w:pStyle w:val="NoSpacing"/>
+              <w:spacing w:beforeLines="60" w:before="144" w:afterLines="60" w:after="144"/>
+              <w:rPr>
+                <w:rFonts w:ascii="Arial" w:eastAsia="SimSun" w:hAnsi="Arial" w:cs="Arial"/>
+                <w:bCs/>
+                <w:i/>
+                <w:color w:val="0000FF"/>
+                <w:sz w:val="20"/>
+                <w:szCs w:val="18"/>
+              </w:rPr>
+            </w:pPr>
+          </w:p>
+        </w:tc>
       </w:tr>
       <w:tr>
         <w:trPr>
@@ -1237,64 +993,32 @@
             </w:r>
           </w:p>
         </w:tc>
-        <w:sdt>
-          <w:sdtPr>
-            <w:rPr>
-              <w:rFonts w:ascii="Arial" w:eastAsia="SimSun" w:hAnsi="Arial" w:cs="Arial"/>
-              <w:bCs/>
-              <w:i/>
-              <w:color w:val="0000FF"/>
-              <w:sz w:val="20"/>
-              <w:szCs w:val="18"/>
-            </w:rPr>
-            <w:id w:val="-347718861"/>
-            <w:placeholder>
-              <w:docPart w:val="04CB107055204A8B8B17BC6B6291F44A"/>
-            </w:placeholder>
-            <w:showingPlcHdr/>
-            <w:text/>
-          </w:sdtPr>
-          <w:sdtContent>
-            <w:tc>
-              <w:tcPr>
-                <w:tcW w:w="5403" w:type="dxa"/>
-                <w:tcBorders>
-                  <w:top w:val="single" w:sz="4" w:space="0" w:color="000000"/>
-                  <w:left w:val="single" w:sz="4" w:space="0" w:color="000000"/>
-                  <w:bottom w:val="single" w:sz="4" w:space="0" w:color="000000"/>
-                  <w:right w:val="single" w:sz="4" w:space="0" w:color="000000"/>
-                </w:tcBorders>
-                <w:shd w:val="clear" w:color="auto" w:fill="auto"/>
-                <w:vAlign w:val="center"/>
-              </w:tcPr>
-              <w:p>
-                <w:pPr>
-                  <w:pStyle w:val="NoSpacing"/>
-                  <w:spacing w:beforeLines="60" w:before="144" w:afterLines="60" w:after="144"/>
-                  <w:rPr>
-                    <w:rFonts w:ascii="Arial" w:eastAsia="SimSun" w:hAnsi="Arial" w:cs="Arial"/>
-                    <w:bCs/>
-                    <w:i/>
-                    <w:color w:val="0000FF"/>
-                    <w:sz w:val="20"/>
-                    <w:szCs w:val="18"/>
-                  </w:rPr>
-                </w:pPr>
-                <w:r>
-                  <w:rPr>
-                    <w:rFonts w:ascii="Arial" w:eastAsia="SimSun" w:hAnsi="Arial" w:cs="Arial"/>
-                    <w:bCs/>
-                    <w:i/>
-                    <w:color w:val="0000FF"/>
-                    <w:sz w:val="20"/>
-                    <w:szCs w:val="18"/>
-                  </w:rPr>
-                  <w:t>Refer to Student Instructions on Assessment Task</w:t>
-                </w:r>
-              </w:p>
-            </w:tc>
-          </w:sdtContent>
-        </w:sdt>
+        <w:tc>
+          <w:tcPr>
+            <w:tcW w:w="5403" w:type="dxa"/>
+            <w:tcBorders>
+              <w:top w:val="single" w:sz="4" w:space="0" w:color="000000"/>
+              <w:left w:val="single" w:sz="4" w:space="0" w:color="000000"/>
+              <w:bottom w:val="single" w:sz="4" w:space="0" w:color="000000"/>
+              <w:right w:val="single" w:sz="4" w:space="0" w:color="000000"/>
+            </w:tcBorders>
+            <w:vAlign w:val="center"/>
+          </w:tcPr>
+          <w:p>
+            <w:pPr>
+              <w:pStyle w:val="NoSpacing"/>
+              <w:spacing w:beforeLines="60" w:before="144" w:afterLines="60" w:after="144"/>
+              <w:rPr>
+                <w:rFonts w:ascii="Arial" w:eastAsia="SimSun" w:hAnsi="Arial" w:cs="Arial"/>
+                <w:bCs/>
+                <w:i/>
+                <w:color w:val="0000FF"/>
+                <w:sz w:val="20"/>
+                <w:szCs w:val="18"/>
+              </w:rPr>
+            </w:pPr>
+          </w:p>
+        </w:tc>
       </w:tr>
       <w:tr>
         <w:trPr>
@@ -1341,7 +1065,6 @@
               <w:bottom w:val="single" w:sz="4" w:space="0" w:color="000000"/>
               <w:right w:val="single" w:sz="4" w:space="0" w:color="000000"/>
             </w:tcBorders>
-            <w:shd w:val="clear" w:color="auto" w:fill="auto"/>
             <w:vAlign w:val="center"/>
           </w:tcPr>
           <w:p>
@@ -3895,287 +3618,6 @@
   <w:docParts>
     <w:docPart>
       <w:docPartPr>
-        <w:name w:val="FE28F2B68AF940FDA5525A33A493E34F"/>
-        <w:category>
-          <w:name w:val="General"/>
-          <w:gallery w:val="placeholder"/>
-        </w:category>
-        <w:types>
-          <w:type w:val="bbPlcHdr"/>
-        </w:types>
-        <w:behaviors>
-          <w:behavior w:val="content"/>
-        </w:behaviors>
-        <w:guid w:val="{4A3CB6F4-804B-4C4C-9B3E-2B0036A9D5A0}"/>
-      </w:docPartPr>
-      <w:docPartBody>
-        <w:p>
-          <w:pPr>
-            <w:pStyle w:val="FE28F2B68AF940FDA5525A33A493E34F4"/>
-          </w:pPr>
-          <w:r>
-            <w:rPr>
-              <w:rFonts w:ascii="Arial" w:eastAsia="SimSun" w:hAnsi="Arial" w:cs="Arial"/>
-              <w:bCs/>
-              <w:i/>
-              <w:color w:val="0000FF"/>
-              <w:sz w:val="20"/>
-              <w:szCs w:val="18"/>
-            </w:rPr>
-            <w:t>List here</w:t>
-          </w:r>
-          <w:r>
-            <w:rPr>
-              <w:rFonts w:ascii="Arial" w:eastAsia="SimSun" w:hAnsi="Arial" w:cs="Arial"/>
-              <w:bCs/>
-              <w:i/>
-              <w:color w:val="0000FF"/>
-              <w:sz w:val="20"/>
-              <w:szCs w:val="18"/>
-            </w:rPr>
-            <w:t>:</w:t>
-          </w:r>
-          <w:r>
-            <w:rPr>
-              <w:rFonts w:ascii="Arial" w:eastAsia="SimSun" w:hAnsi="Arial" w:cs="Arial"/>
-              <w:bCs/>
-              <w:i/>
-              <w:color w:val="0000FF"/>
-              <w:sz w:val="20"/>
-              <w:szCs w:val="18"/>
-            </w:rPr>
-            <w:t xml:space="preserve"> campus, classroom, workshop, workplace, simulated work environment</w:t>
-          </w:r>
-        </w:p>
-      </w:docPartBody>
-    </w:docPart>
-    <w:docPart>
-      <w:docPartPr>
-        <w:name w:val="4D34EA57128A4DB488F9A0E12FABC56E"/>
-        <w:category>
-          <w:name w:val="General"/>
-          <w:gallery w:val="placeholder"/>
-        </w:category>
-        <w:types>
-          <w:type w:val="bbPlcHdr"/>
-        </w:types>
-        <w:behaviors>
-          <w:behavior w:val="content"/>
-        </w:behaviors>
-        <w:guid w:val="{B91A724C-5E93-49AB-B33A-9D3719CD2EBE}"/>
-      </w:docPartPr>
-      <w:docPartBody>
-        <w:p>
-          <w:pPr>
-            <w:pStyle w:val="4D34EA57128A4DB488F9A0E12FABC56E4"/>
-          </w:pPr>
-          <w:r>
-            <w:rPr>
-              <w:rFonts w:ascii="Arial" w:eastAsia="SimSun" w:hAnsi="Arial" w:cs="Arial"/>
-              <w:bCs/>
-              <w:i/>
-              <w:color w:val="0000FF"/>
-              <w:sz w:val="20"/>
-              <w:szCs w:val="18"/>
-            </w:rPr>
-            <w:t>Date of assessment</w:t>
-          </w:r>
-        </w:p>
-      </w:docPartBody>
-    </w:docPart>
-    <w:docPart>
-      <w:docPartPr>
-        <w:name w:val="C4E36727C7B44844ABB3129335FBED3C"/>
-        <w:category>
-          <w:name w:val="General"/>
-          <w:gallery w:val="placeholder"/>
-        </w:category>
-        <w:types>
-          <w:type w:val="bbPlcHdr"/>
-        </w:types>
-        <w:behaviors>
-          <w:behavior w:val="content"/>
-        </w:behaviors>
-        <w:guid w:val="{74CD03AD-E5BA-4001-B724-FCBDCCC12353}"/>
-      </w:docPartPr>
-      <w:docPartBody>
-        <w:p>
-          <w:pPr>
-            <w:pStyle w:val="C4E36727C7B44844ABB3129335FBED3C4"/>
-          </w:pPr>
-          <w:r>
-            <w:rPr>
-              <w:rFonts w:ascii="Arial" w:eastAsia="SimSun" w:hAnsi="Arial" w:cs="Arial"/>
-              <w:bCs/>
-              <w:i/>
-              <w:color w:val="0000FF"/>
-              <w:sz w:val="20"/>
-              <w:szCs w:val="18"/>
-            </w:rPr>
-            <w:t>Time allocated for assessment</w:t>
-          </w:r>
-        </w:p>
-      </w:docPartBody>
-    </w:docPart>
-    <w:docPart>
-      <w:docPartPr>
-        <w:name w:val="A7722ECEAAD64248A7C6FFC9ABF76B13"/>
-        <w:category>
-          <w:name w:val="General"/>
-          <w:gallery w:val="placeholder"/>
-        </w:category>
-        <w:types>
-          <w:type w:val="bbPlcHdr"/>
-        </w:types>
-        <w:behaviors>
-          <w:behavior w:val="content"/>
-        </w:behaviors>
-        <w:guid w:val="{3645FCF7-D349-4A20-B64A-E4D543B0E764}"/>
-      </w:docPartPr>
-      <w:docPartBody>
-        <w:p>
-          <w:pPr>
-            <w:pStyle w:val="A7722ECEAAD64248A7C6FFC9ABF76B134"/>
-          </w:pPr>
-          <w:r>
-            <w:rPr>
-              <w:rFonts w:ascii="Arial" w:eastAsia="SimSun" w:hAnsi="Arial" w:cs="Arial"/>
-              <w:bCs/>
-              <w:i/>
-              <w:color w:val="0000FF"/>
-              <w:sz w:val="20"/>
-              <w:szCs w:val="18"/>
-            </w:rPr>
-            <w:t xml:space="preserve">List here all the resources required </w:t>
-          </w:r>
-          <w:r>
-            <w:rPr>
-              <w:rFonts w:ascii="Arial" w:eastAsia="SimSun" w:hAnsi="Arial" w:cs="Arial"/>
-              <w:bCs/>
-              <w:i/>
-              <w:color w:val="0000FF"/>
-              <w:sz w:val="20"/>
-              <w:szCs w:val="18"/>
-            </w:rPr>
-            <w:t xml:space="preserve">to conduct assessment task </w:t>
-          </w:r>
-          <w:r>
-            <w:rPr>
-              <w:rFonts w:ascii="Arial" w:eastAsia="SimSun" w:hAnsi="Arial" w:cs="Arial"/>
-              <w:bCs/>
-              <w:i/>
-              <w:color w:val="0000FF"/>
-              <w:sz w:val="20"/>
-              <w:szCs w:val="18"/>
-            </w:rPr>
-            <w:t xml:space="preserve">eg tools, materials, documentation, JSAs, PPE, </w:t>
-          </w:r>
-          <w:r>
-            <w:rPr>
-              <w:rFonts w:ascii="Arial" w:eastAsia="SimSun" w:hAnsi="Arial" w:cs="Arial"/>
-              <w:bCs/>
-              <w:i/>
-              <w:color w:val="0000FF"/>
-              <w:sz w:val="20"/>
-              <w:szCs w:val="18"/>
-            </w:rPr>
-            <w:t>mannequins, student instruction guides, workplace simulation equipment</w:t>
-          </w:r>
-        </w:p>
-      </w:docPartBody>
-    </w:docPart>
-    <w:docPart>
-      <w:docPartPr>
-        <w:name w:val="3114E56CADCB49AA8E09B8ADBDB1DE15"/>
-        <w:category>
-          <w:name w:val="General"/>
-          <w:gallery w:val="placeholder"/>
-        </w:category>
-        <w:types>
-          <w:type w:val="bbPlcHdr"/>
-        </w:types>
-        <w:behaviors>
-          <w:behavior w:val="content"/>
-        </w:behaviors>
-        <w:guid w:val="{0A43D970-B837-4FD5-B6CF-84600FB91D8D}"/>
-      </w:docPartPr>
-      <w:docPartBody>
-        <w:p>
-          <w:pPr>
-            <w:pStyle w:val="3114E56CADCB49AA8E09B8ADBDB1DE154"/>
-          </w:pPr>
-          <w:r>
-            <w:rPr>
-              <w:rFonts w:ascii="Arial" w:eastAsia="SimSun" w:hAnsi="Arial" w:cs="Arial"/>
-              <w:bCs/>
-              <w:i/>
-              <w:color w:val="0000FF"/>
-              <w:sz w:val="20"/>
-              <w:szCs w:val="18"/>
-            </w:rPr>
-            <w:t xml:space="preserve">Include: </w:t>
-          </w:r>
-          <w:r>
-            <w:rPr>
-              <w:rFonts w:ascii="Arial" w:eastAsia="SimSun" w:hAnsi="Arial" w:cs="Arial"/>
-              <w:bCs/>
-              <w:i/>
-              <w:color w:val="0000FF"/>
-              <w:sz w:val="20"/>
-              <w:szCs w:val="18"/>
-            </w:rPr>
-            <w:t xml:space="preserve">workshop safety briefs, </w:t>
-          </w:r>
-          <w:r>
-            <w:rPr>
-              <w:rFonts w:ascii="Arial" w:eastAsia="SimSun" w:hAnsi="Arial" w:cs="Arial"/>
-              <w:bCs/>
-              <w:i/>
-              <w:color w:val="0000FF"/>
-              <w:sz w:val="20"/>
-              <w:szCs w:val="18"/>
-            </w:rPr>
-            <w:t>material or tool safety guides and requirements, evacuation plans, manual handling instructions, MSDS, PPE instructions</w:t>
-          </w:r>
-        </w:p>
-      </w:docPartBody>
-    </w:docPart>
-    <w:docPart>
-      <w:docPartPr>
-        <w:name w:val="04CB107055204A8B8B17BC6B6291F44A"/>
-        <w:category>
-          <w:name w:val="General"/>
-          <w:gallery w:val="placeholder"/>
-        </w:category>
-        <w:types>
-          <w:type w:val="bbPlcHdr"/>
-        </w:types>
-        <w:behaviors>
-          <w:behavior w:val="content"/>
-        </w:behaviors>
-        <w:guid w:val="{3816A360-E458-47FC-BBDF-DA099DF592F4}"/>
-      </w:docPartPr>
-      <w:docPartBody>
-        <w:p>
-          <w:pPr>
-            <w:pStyle w:val="04CB107055204A8B8B17BC6B6291F44A4"/>
-          </w:pPr>
-          <w:r>
-            <w:rPr>
-              <w:rFonts w:ascii="Arial" w:eastAsia="SimSun" w:hAnsi="Arial" w:cs="Arial"/>
-              <w:bCs/>
-              <w:i/>
-              <w:color w:val="0000FF"/>
-              <w:sz w:val="20"/>
-              <w:szCs w:val="18"/>
-            </w:rPr>
-            <w:t>Refer to Student Instructions on Assessment Task</w:t>
-          </w:r>
-        </w:p>
-      </w:docPartBody>
-    </w:docPart>
-    <w:docPart>
-      <w:docPartPr>
         <w:name w:val="428D70867DC942ACB7234007D1DC2FE8"/>
         <w:category>
           <w:name w:val="General"/>
@@ -4386,6 +3828,7 @@
     <w:rsid w:val="000A7B49"/>
     <w:rsid w:val="001233DD"/>
     <w:rsid w:val="001A6973"/>
+    <w:rsid w:val="00213D0C"/>
     <w:rsid w:val="003963E2"/>
     <w:rsid w:val="003A6EE7"/>
     <w:rsid w:val="00461DBE"/>
@@ -4399,6 +3842,7 @@
     <w:rsid w:val="007B258B"/>
     <w:rsid w:val="00831335"/>
     <w:rsid w:val="00847647"/>
+    <w:rsid w:val="008872C6"/>
     <w:rsid w:val="009D7603"/>
     <w:rsid w:val="00AC766B"/>
     <w:rsid w:val="00B10576"/>
@@ -4863,17 +4307,6 @@
       <w:color w:val="808080"/>
     </w:rPr>
   </w:style>
-  <w:style w:type="paragraph" w:customStyle="1" w:styleId="6CD51255B8D34959ABEC5CCE2471AA825">
-    <w:name w:val="6CD51255B8D34959ABEC5CCE2471AA825"/>
-    <w:rsid w:val="005463B1"/>
-    <w:pPr>
-      <w:spacing w:after="0" w:line="240" w:lineRule="auto"/>
-    </w:pPr>
-    <w:rPr>
-      <w:rFonts w:eastAsiaTheme="minorHAnsi"/>
-      <w:lang w:eastAsia="en-US"/>
-    </w:rPr>
-  </w:style>
   <w:style w:type="paragraph" w:customStyle="1" w:styleId="FE28F2B68AF940FDA5525A33A493E34F4">
     <w:name w:val="FE28F2B68AF940FDA5525A33A493E34F4"/>
     <w:rsid w:val="005463B1"/>
@@ -5268,15 +4701,6 @@
 </file>
 
 <file path=customXml/item1.xml><?xml version="1.0" encoding="utf-8"?>
-<?mso-contentType ?>
-<FormTemplates xmlns="http://schemas.microsoft.com/sharepoint/v3/contenttype/forms">
-  <Display>DocumentLibraryForm</Display>
-  <Edit>DocumentLibraryForm</Edit>
-  <New>DocumentLibraryForm</New>
-</FormTemplates>
-</file>
-
-<file path=customXml/item2.xml><?xml version="1.0" encoding="utf-8"?>
 <p:properties xmlns:p="http://schemas.microsoft.com/office/2006/metadata/properties" xmlns:xsi="http://www.w3.org/2001/XMLSchema-instance" xmlns:pc="http://schemas.microsoft.com/office/infopath/2007/PartnerControls">
   <documentManagement>
     <Entity xmlns="f76bb202-e0ee-44b5-81bd-1165e74daad9">NM TAFE</Entity>
@@ -5327,9 +4751,63 @@
 </p:properties>
 </file>
 
+<file path=customXml/item2.xml><?xml version="1.0" encoding="utf-8"?>
+<?mso-contentType ?>
+<FormTemplates xmlns="http://schemas.microsoft.com/sharepoint/v3/contenttype/forms">
+  <Display>DocumentLibraryForm</Display>
+  <Edit>DocumentLibraryForm</Edit>
+  <New>DocumentLibraryForm</New>
+</FormTemplates>
+</file>
+
 <file path=customXml/item3.xml><?xml version="1.0" encoding="utf-8"?>
 <?mso-contentType ?>
-<SharedContentType xmlns="Microsoft.SharePoint.Taxonomy.ContentTypeSync" SourceId="598972e7-4f0e-48c0-bb56-a9f22e25d3ec" ContentTypeId="0x0101000E64A23F1383D74E9A471A69050FD18B" PreviousValue="false" LastSyncTimeStamp="2021-09-09T00:35:20.36Z"/>
+<spe:Receivers xmlns:spe="http://schemas.microsoft.com/sharepoint/events">
+  <Receiver>
+    <Name>Document ID Generator</Name>
+    <Synchronization>Synchronous</Synchronization>
+    <Type>10001</Type>
+    <SequenceNumber>1000</SequenceNumber>
+    <Url/>
+    <Assembly>Microsoft.Office.DocumentManagement, Version=16.0.0.0, Culture=neutral, PublicKeyToken=71e9bce111e9429c</Assembly>
+    <Class>Microsoft.Office.DocumentManagement.Internal.DocIdHandler</Class>
+    <Data/>
+    <Filter/>
+  </Receiver>
+  <Receiver>
+    <Name>Document ID Generator</Name>
+    <Synchronization>Synchronous</Synchronization>
+    <Type>10002</Type>
+    <SequenceNumber>1001</SequenceNumber>
+    <Url/>
+    <Assembly>Microsoft.Office.DocumentManagement, Version=16.0.0.0, Culture=neutral, PublicKeyToken=71e9bce111e9429c</Assembly>
+    <Class>Microsoft.Office.DocumentManagement.Internal.DocIdHandler</Class>
+    <Data/>
+    <Filter/>
+  </Receiver>
+  <Receiver>
+    <Name>Document ID Generator</Name>
+    <Synchronization>Synchronous</Synchronization>
+    <Type>10004</Type>
+    <SequenceNumber>1002</SequenceNumber>
+    <Url/>
+    <Assembly>Microsoft.Office.DocumentManagement, Version=16.0.0.0, Culture=neutral, PublicKeyToken=71e9bce111e9429c</Assembly>
+    <Class>Microsoft.Office.DocumentManagement.Internal.DocIdHandler</Class>
+    <Data/>
+    <Filter/>
+  </Receiver>
+  <Receiver>
+    <Name>Document ID Generator</Name>
+    <Synchronization>Synchronous</Synchronization>
+    <Type>10006</Type>
+    <SequenceNumber>1003</SequenceNumber>
+    <Url/>
+    <Assembly>Microsoft.Office.DocumentManagement, Version=16.0.0.0, Culture=neutral, PublicKeyToken=71e9bce111e9429c</Assembly>
+    <Class>Microsoft.Office.DocumentManagement.Internal.DocIdHandler</Class>
+    <Data/>
+    <Filter/>
+  </Receiver>
+</spe:Receivers>
 </file>
 
 <file path=customXml/item4.xml><?xml version="1.0" encoding="utf-8"?>
@@ -5786,63 +5264,10 @@
 
 <file path=customXml/item5.xml><?xml version="1.0" encoding="utf-8"?>
 <?mso-contentType ?>
-<spe:Receivers xmlns:spe="http://schemas.microsoft.com/sharepoint/events">
-  <Receiver>
-    <Name>Document ID Generator</Name>
-    <Synchronization>Synchronous</Synchronization>
-    <Type>10001</Type>
-    <SequenceNumber>1000</SequenceNumber>
-    <Url/>
-    <Assembly>Microsoft.Office.DocumentManagement, Version=16.0.0.0, Culture=neutral, PublicKeyToken=71e9bce111e9429c</Assembly>
-    <Class>Microsoft.Office.DocumentManagement.Internal.DocIdHandler</Class>
-    <Data/>
-    <Filter/>
-  </Receiver>
-  <Receiver>
-    <Name>Document ID Generator</Name>
-    <Synchronization>Synchronous</Synchronization>
-    <Type>10002</Type>
-    <SequenceNumber>1001</SequenceNumber>
-    <Url/>
-    <Assembly>Microsoft.Office.DocumentManagement, Version=16.0.0.0, Culture=neutral, PublicKeyToken=71e9bce111e9429c</Assembly>
-    <Class>Microsoft.Office.DocumentManagement.Internal.DocIdHandler</Class>
-    <Data/>
-    <Filter/>
-  </Receiver>
-  <Receiver>
-    <Name>Document ID Generator</Name>
-    <Synchronization>Synchronous</Synchronization>
-    <Type>10004</Type>
-    <SequenceNumber>1002</SequenceNumber>
-    <Url/>
-    <Assembly>Microsoft.Office.DocumentManagement, Version=16.0.0.0, Culture=neutral, PublicKeyToken=71e9bce111e9429c</Assembly>
-    <Class>Microsoft.Office.DocumentManagement.Internal.DocIdHandler</Class>
-    <Data/>
-    <Filter/>
-  </Receiver>
-  <Receiver>
-    <Name>Document ID Generator</Name>
-    <Synchronization>Synchronous</Synchronization>
-    <Type>10006</Type>
-    <SequenceNumber>1003</SequenceNumber>
-    <Url/>
-    <Assembly>Microsoft.Office.DocumentManagement, Version=16.0.0.0, Culture=neutral, PublicKeyToken=71e9bce111e9429c</Assembly>
-    <Class>Microsoft.Office.DocumentManagement.Internal.DocIdHandler</Class>
-    <Data/>
-    <Filter/>
-  </Receiver>
-</spe:Receivers>
+<SharedContentType xmlns="Microsoft.SharePoint.Taxonomy.ContentTypeSync" SourceId="598972e7-4f0e-48c0-bb56-a9f22e25d3ec" ContentTypeId="0x0101000E64A23F1383D74E9A471A69050FD18B" PreviousValue="false" LastSyncTimeStamp="2021-09-09T00:35:20.36Z"/>
 </file>
 
 <file path=customXml/itemProps1.xml><?xml version="1.0" encoding="utf-8"?>
-<ds:datastoreItem xmlns:ds="http://schemas.openxmlformats.org/officeDocument/2006/customXml" ds:itemID="{64B2EF07-4BD0-4335-A9D9-0DA7B5F9CCC3}">
-  <ds:schemaRefs>
-    <ds:schemaRef ds:uri="http://schemas.microsoft.com/sharepoint/v3/contenttype/forms"/>
-  </ds:schemaRefs>
-</ds:datastoreItem>
-</file>
-
-<file path=customXml/itemProps2.xml><?xml version="1.0" encoding="utf-8"?>
 <ds:datastoreItem xmlns:ds="http://schemas.openxmlformats.org/officeDocument/2006/customXml" ds:itemID="{CFDE6D42-4381-45AA-88B8-C68E4B5C28A1}">
   <ds:schemaRefs>
     <ds:schemaRef ds:uri="http://schemas.microsoft.com/office/2006/metadata/properties"/>
@@ -5855,10 +5280,18 @@
 </ds:datastoreItem>
 </file>
 
+<file path=customXml/itemProps2.xml><?xml version="1.0" encoding="utf-8"?>
+<ds:datastoreItem xmlns:ds="http://schemas.openxmlformats.org/officeDocument/2006/customXml" ds:itemID="{64B2EF07-4BD0-4335-A9D9-0DA7B5F9CCC3}">
+  <ds:schemaRefs>
+    <ds:schemaRef ds:uri="http://schemas.microsoft.com/sharepoint/v3/contenttype/forms"/>
+  </ds:schemaRefs>
+</ds:datastoreItem>
+</file>
+
 <file path=customXml/itemProps3.xml><?xml version="1.0" encoding="utf-8"?>
-<ds:datastoreItem xmlns:ds="http://schemas.openxmlformats.org/officeDocument/2006/customXml" ds:itemID="{1B13CA0A-6275-4C91-A075-4A957E6FAEB2}">
+<ds:datastoreItem xmlns:ds="http://schemas.openxmlformats.org/officeDocument/2006/customXml" ds:itemID="{E6C721B5-2FAF-4183-999F-62A7398911D0}">
   <ds:schemaRefs>
-    <ds:schemaRef ds:uri="Microsoft.SharePoint.Taxonomy.ContentTypeSync"/>
+    <ds:schemaRef ds:uri="http://schemas.microsoft.com/sharepoint/events"/>
   </ds:schemaRefs>
 </ds:datastoreItem>
 </file>
@@ -5886,9 +5319,9 @@
 </file>
 
 <file path=customXml/itemProps5.xml><?xml version="1.0" encoding="utf-8"?>
-<ds:datastoreItem xmlns:ds="http://schemas.openxmlformats.org/officeDocument/2006/customXml" ds:itemID="{E6C721B5-2FAF-4183-999F-62A7398911D0}">
+<ds:datastoreItem xmlns:ds="http://schemas.openxmlformats.org/officeDocument/2006/customXml" ds:itemID="{1B13CA0A-6275-4C91-A075-4A957E6FAEB2}">
   <ds:schemaRefs>
-    <ds:schemaRef ds:uri="http://schemas.microsoft.com/sharepoint/events"/>
+    <ds:schemaRef ds:uri="Microsoft.SharePoint.Taxonomy.ContentTypeSync"/>
   </ds:schemaRefs>
 </ds:datastoreItem>
 </file>
</xml_diff>